<commit_message>
[docs]: Repoint handover paths and verification scripts to the archived revisions folder
</commit_message>
<xml_diff>
--- a/docs_methodology/HandoverDocument/NEXA_Handover-and-Maintenance-Guide_v3.4.docx
+++ b/docs_methodology/HandoverDocument/NEXA_Handover-and-Maintenance-Guide_v3.4.docx
@@ -6143,7 +6143,7 @@
         <w:rPr>
           <w:rStyle w:val="VerbatimChar"/>
         </w:rPr>
-        <w:t xml:space="preserve">docs_implementation/documentation-revisions/</w:t>
+        <w:t xml:space="preserve">docs_implementation/DONE/DONE-documentation-revisions/</w:t>
       </w:r>
       <w:r>
         <w:t xml:space="preserve">, the working record of the</w:t>
@@ -7271,7 +7271,7 @@
         <w:rPr>
           <w:rStyle w:val="VerbatimChar"/>
         </w:rPr>
-        <w:t xml:space="preserve">docs_implementation/documentation-revisions/Results/</w:t>
+        <w:t xml:space="preserve">docs_implementation/DONE/DONE-documentation-revisions/Results/</w:t>
       </w:r>
       <w:r>
         <w:t xml:space="preserve">, one per stage group, which</w:t>
@@ -11185,7 +11185,7 @@
               <w:rPr>
                 <w:rStyle w:val="VerbatimCharSmall"/>
               </w:rPr>
-              <w:t xml:space="preserve">docs_implementation/documentation-revisions/</w:t>
+              <w:t xml:space="preserve">docs_implementation/DONE/DONE-documentation-revisions/</w:t>
             </w:r>
           </w:p>
         </w:tc>
@@ -18735,7 +18735,7 @@
         <w:rPr>
           <w:rStyle w:val="VerbatimChar"/>
         </w:rPr>
-        <w:t xml:space="preserve">docs_implementation/documentation-revisions/Resources/1-s2.0-S2352484725006365-main.pdf</w:t>
+        <w:t xml:space="preserve">docs_implementation/DONE/DONE-documentation-revisions/Resources/1-s2.0-S2352484725006365-main.pdf</w:t>
       </w:r>
       <w:r>
         <w:t xml:space="preserve">.</w:t>
@@ -18801,7 +18801,7 @@
         <w:rPr>
           <w:rStyle w:val="VerbatimChar"/>
         </w:rPr>
-        <w:t xml:space="preserve">docs_implementation/documentation-revisions/DeepResearchPrompts/responses/RT02_chv_ev_v2g_source_paper.md</w:t>
+        <w:t xml:space="preserve">docs_implementation/DONE/DONE-documentation-revisions/DeepResearchPrompts/responses/RT02_chv_ev_v2g_source_paper.md</w:t>
       </w:r>
       <w:r>
         <w:t xml:space="preserve">.</w:t>
@@ -20443,7 +20443,7 @@
         <w:rPr>
           <w:rStyle w:val="VerbatimChar"/>
         </w:rPr>
-        <w:t xml:space="preserve">docs_implementation/documentation-revisions/Submission/previous/PROPOSAL_Simulation-File-Naming_v0.3.md</w:t>
+        <w:t xml:space="preserve">docs_implementation/DONE/DONE-documentation-revisions/Submission/previous/PROPOSAL_Simulation-File-Naming_v0.3.md</w:t>
       </w:r>
       <w:r>
         <w:t xml:space="preserve">).</w:t>
@@ -22074,7 +22074,7 @@
         <w:rPr>
           <w:rStyle w:val="VerbatimChar"/>
         </w:rPr>
-        <w:t xml:space="preserve">docs_implementation/documentation-revisions/Submission/submission1/N-LENS_Simulation-Model-Index.csv</w:t>
+        <w:t xml:space="preserve">docs_implementation/DONE/DONE-documentation-revisions/Submission/submission1/N-LENS_Simulation-Model-Index.csv</w:t>
       </w:r>
     </w:p>
     <w:p>
@@ -23187,7 +23187,7 @@
         <w:rPr>
           <w:rStyle w:val="VerbatimChar"/>
         </w:rPr>
-        <w:t xml:space="preserve">node docs_implementation/documentation-revisions/Submission/tools/dump_publication_state.js &gt; pubstate.json</w:t>
+        <w:t xml:space="preserve">node docs_implementation/DONE/DONE-documentation-revisions/Submission/tools/dump_publication_state.js &gt; pubstate.json</w:t>
       </w:r>
       <w:r>
         <w:br/>
@@ -23196,7 +23196,7 @@
         <w:rPr>
           <w:rStyle w:val="VerbatimChar"/>
         </w:rPr>
-        <w:t xml:space="preserve">python docs_implementation/documentation-revisions/Submission/tools/build_simulation_model_index.py pubstate.json</w:t>
+        <w:t xml:space="preserve">python docs_implementation/DONE/DONE-documentation-revisions/Submission/tools/build_simulation_model_index.py pubstate.json</w:t>
       </w:r>
     </w:p>
     <w:p>
@@ -26007,7 +26007,7 @@
         <w:rPr>
           <w:rStyle w:val="VerbatimChar"/>
         </w:rPr>
-        <w:t xml:space="preserve">docs_implementation/documentation-revisions/Results/</w:t>
+        <w:t xml:space="preserve">docs_implementation/DONE/DONE-documentation-revisions/Results/</w:t>
       </w:r>
       <w:r>
         <w:t xml:space="preserve"> </w:t>
@@ -36614,7 +36614,7 @@
         <w:rPr>
           <w:rStyle w:val="VerbatimChar"/>
         </w:rPr>
-        <w:t xml:space="preserve">docs_implementation/documentation-revisions/Results/</w:t>
+        <w:t xml:space="preserve">docs_implementation/DONE/DONE-documentation-revisions/Results/</w:t>
       </w:r>
       <w:r>
         <w:t xml:space="preserve">, run with</w:t>
@@ -37889,7 +37889,7 @@
         <w:rPr>
           <w:rStyle w:val="VerbatimChar"/>
         </w:rPr>
-        <w:t xml:space="preserve">docs_implementation/documentation-revisions/Debugs/DEBUG-REGISTER.md</w:t>
+        <w:t xml:space="preserve">docs_implementation/DONE/DONE-documentation-revisions/Debugs/DEBUG-REGISTER.md</w:t>
       </w:r>
       <w:r>
         <w:t xml:space="preserve"> </w:t>
@@ -44759,9 +44759,9 @@
         <w:tblLook w:firstRow="1" w:lastRow="0" w:firstColumn="0" w:lastColumn="0" w:noHBand="0" w:noVBand="0" w:val="0020"/>
       </w:tblPr>
       <w:tblGrid>
-        <w:gridCol w:w="1397"/>
-        <w:gridCol w:w="2395"/>
-        <w:gridCol w:w="4126"/>
+        <w:gridCol w:w="1386"/>
+        <w:gridCol w:w="2310"/>
+        <w:gridCol w:w="4224"/>
       </w:tblGrid>
       <w:tr>
         <w:trPr>
@@ -44840,7 +44840,7 @@
               <w:rPr>
                 <w:rStyle w:val="VerbatimCharSmall"/>
               </w:rPr>
-              <w:t xml:space="preserve">docs_implementation/documentation-revisions/Submission/NEXA_Handover-and-Maintenance-Guide_v3.4.md</w:t>
+              <w:t xml:space="preserve">docs_implementation/DONE/DONE-documentation-revisions/Submission/NEXA_Handover-and-Maintenance-Guide_v3.4.md</w:t>
             </w:r>
             <w:r>
               <w:t xml:space="preserve">; also sent as</w:t>
@@ -44896,7 +44896,7 @@
               <w:rPr>
                 <w:rStyle w:val="VerbatimCharSmall"/>
               </w:rPr>
-              <w:t xml:space="preserve">docs_implementation/documentation-revisions/Submission/submission1/N-LENS_Simulation-Model-Index.csv</w:t>
+              <w:t xml:space="preserve">docs_implementation/DONE/DONE-documentation-revisions/Submission/submission1/N-LENS_Simulation-Model-Index.csv</w:t>
             </w:r>
             <w:r>
               <w:t xml:space="preserve">; section 6.13</w:t>
@@ -44943,7 +44943,7 @@
               <w:rPr>
                 <w:rStyle w:val="VerbatimCharSmall"/>
               </w:rPr>
-              <w:t xml:space="preserve">docs_implementation/documentation-revisions/Results/*.js</w:t>
+              <w:t xml:space="preserve">docs_implementation/DONE/DONE-documentation-revisions/Results/*.js</w:t>
             </w:r>
             <w:r>
               <w:t xml:space="preserve">; section 10.2</w:t>
@@ -47732,7 +47732,7 @@
         <w:rPr>
           <w:rStyle w:val="VerbatimChar"/>
         </w:rPr>
-        <w:t xml:space="preserve">docs_implementation/documentation-revisions/DeepResearchPrompts/responses/RT02_chv_ev_v2g_source_paper.md</w:t>
+        <w:t xml:space="preserve">docs_implementation/DONE/DONE-documentation-revisions/DeepResearchPrompts/responses/RT02_chv_ev_v2g_source_paper.md</w:t>
       </w:r>
       <w:r>
         <w:t xml:space="preserve">. The 15 kWh per EV daily demand carries a stated basis in</w:t>
@@ -50497,7 +50497,7 @@
         <w:rPr>
           <w:rStyle w:val="VerbatimChar"/>
         </w:rPr>
-        <w:t xml:space="preserve">docs_implementation/documentation-revisions/Resources/1-s2.0-S2352484725006365-main.pdf</w:t>
+        <w:t xml:space="preserve">docs_implementation/DONE/DONE-documentation-revisions/Resources/1-s2.0-S2352484725006365-main.pdf</w:t>
       </w:r>
       <w:r>
         <w:t xml:space="preserve">.</w:t>
@@ -51938,7 +51938,7 @@
         <w:rPr>
           <w:rStyle w:val="VerbatimChar"/>
         </w:rPr>
-        <w:t xml:space="preserve">docs_implementation/documentation-revisions/</w:t>
+        <w:t xml:space="preserve">docs_implementation/DONE/DONE-documentation-revisions/</w:t>
       </w:r>
       <w:r>
         <w:t xml:space="preserve"> </w:t>
@@ -57542,6 +57542,119 @@
                 <w:rStyle w:val="VerbatimCharSmall"/>
               </w:rPr>
               <w:t xml:space="preserve">docs_methodology/HandoverDocument/</w:t>
+            </w:r>
+          </w:p>
+        </w:tc>
+        <w:tc>
+          <w:tcPr/>
+          <w:p>
+            <w:pPr>
+              <w:pStyle w:val="TableCellText"/>
+            </w:pPr>
+            <w:r>
+              <w:t xml:space="preserve">⬜</w:t>
+            </w:r>
+          </w:p>
+        </w:tc>
+      </w:tr>
+      <w:tr>
+        <w:tc>
+          <w:tcPr/>
+          <w:p>
+            <w:pPr>
+              <w:pStyle w:val="TableCellText"/>
+            </w:pPr>
+            <w:r>
+              <w:rPr>
+                <w:b/>
+                <w:bCs/>
+              </w:rPr>
+              <w:t xml:space="preserve">3.4</w:t>
+            </w:r>
+            <w:r>
+              <w:t xml:space="preserve">, sixth addendum</w:t>
+            </w:r>
+          </w:p>
+        </w:tc>
+        <w:tc>
+          <w:tcPr/>
+          <w:p>
+            <w:pPr>
+              <w:pStyle w:val="TableCellText"/>
+            </w:pPr>
+            <w:r>
+              <w:rPr>
+                <w:b/>
+                <w:bCs/>
+              </w:rPr>
+              <w:t xml:space="preserve">2026-10-07</w:t>
+            </w:r>
+          </w:p>
+        </w:tc>
+        <w:tc>
+          <w:tcPr/>
+          <w:p>
+            <w:pPr>
+              <w:pStyle w:val="TableCellText"/>
+            </w:pPr>
+            <w:r>
+              <w:rPr>
+                <w:b/>
+                <w:bCs/>
+              </w:rPr>
+              <w:t xml:space="preserve">The revision round archived.</w:t>
+            </w:r>
+            <w:r>
+              <w:t xml:space="preserve"> </w:t>
+            </w:r>
+            <w:r>
+              <w:rPr>
+                <w:rStyle w:val="VerbatimCharSmall"/>
+              </w:rPr>
+              <w:t xml:space="preserve">docs_implementation/documentation-revisions/</w:t>
+            </w:r>
+            <w:r>
+              <w:t xml:space="preserve"> </w:t>
+            </w:r>
+            <w:r>
+              <w:t xml:space="preserve">moved to</w:t>
+            </w:r>
+            <w:r>
+              <w:t xml:space="preserve"> </w:t>
+            </w:r>
+            <w:r>
+              <w:rPr>
+                <w:rStyle w:val="VerbatimCharSmall"/>
+              </w:rPr>
+              <w:t xml:space="preserve">docs_implementation/DONE/DONE-documentation-revisions/</w:t>
+            </w:r>
+            <w:r>
+              <w:t xml:space="preserve">, and every path to it in this guide follows, except two dated rows that record the old one. The verification scripts in</w:t>
+            </w:r>
+            <w:r>
+              <w:t xml:space="preserve"> </w:t>
+            </w:r>
+            <w:r>
+              <w:rPr>
+                <w:rStyle w:val="VerbatimCharSmall"/>
+              </w:rPr>
+              <w:t xml:space="preserve">Results/</w:t>
+            </w:r>
+            <w:r>
+              <w:t xml:space="preserve"> </w:t>
+            </w:r>
+            <w:r>
+              <w:t xml:space="preserve">find the repository root one folder further up.</w:t>
+            </w:r>
+            <w:r>
+              <w:t xml:space="preserve"> </w:t>
+            </w:r>
+            <w:r>
+              <w:rPr>
+                <w:b/>
+                <w:bCs/>
+              </w:rPr>
+              <w:t xml:space="preserve">Nothing else changed</w:t>
             </w:r>
           </w:p>
         </w:tc>
@@ -60657,7 +60770,7 @@
         <w:rPr>
           <w:rStyle w:val="VerbatimChar"/>
         </w:rPr>
-        <w:t xml:space="preserve">docs_implementation/documentation-revisions/Results/RESULT-16_A23_Live-Site-QA_2026-09-09.md</w:t>
+        <w:t xml:space="preserve">docs_implementation/DONE/DONE-documentation-revisions/Results/RESULT-16_A23_Live-Site-QA_2026-09-09.md</w:t>
       </w:r>
       <w:r>
         <w:t xml:space="preserve">.</w:t>
@@ -63528,7 +63641,7 @@
         <w:rPr>
           <w:rStyle w:val="VerbatimChar"/>
         </w:rPr>
-        <w:t xml:space="preserve">docs_implementation/documentation-revisions/Shivram-Furqan/Feedback/FEEDBACK_LOG.md</w:t>
+        <w:t xml:space="preserve">docs_implementation/DONE/DONE-documentation-revisions/Shivram-Furqan/Feedback/FEEDBACK_LOG.md</w:t>
       </w:r>
       <w:r>
         <w:t xml:space="preserve">.</w:t>

</xml_diff>

<commit_message>
[docs]: Add site access gate section to handover guide and password system notes
</commit_message>
<xml_diff>
--- a/docs_methodology/HandoverDocument/NEXA_Handover-and-Maintenance-Guide_v3.4.docx
+++ b/docs_methodology/HandoverDocument/NEXA_Handover-and-Maintenance-Guide_v3.4.docx
@@ -7497,7 +7497,7 @@
     <w:bookmarkEnd w:id="32"/>
     <w:bookmarkEnd w:id="33"/>
     <w:bookmarkEnd w:id="34"/>
-    <w:bookmarkStart w:id="156" w:name="part-iii.-reference"/>
+    <w:bookmarkStart w:id="157" w:name="part-iii.-reference"/>
     <w:p>
       <w:pPr>
         <w:pStyle w:val="Heading1"/>
@@ -42688,7 +42688,7 @@
     </w:p>
     <w:bookmarkEnd w:id="118"/>
     <w:bookmarkEnd w:id="119"/>
-    <w:bookmarkStart w:id="126" w:name="accounts-access-and-ownership"/>
+    <w:bookmarkStart w:id="127" w:name="accounts-access-and-ownership"/>
     <w:p>
       <w:pPr>
         <w:pStyle w:val="Heading2"/>
@@ -45131,22 +45131,14 @@
         </w:tc>
       </w:tr>
     </w:tbl>
-    <w:p>
-      <w:r>
-        <w:pict>
-          <v:rect style="width:0;height:1.5pt" o:hralign="center" o:hrstd="t" o:hr="t"/>
-        </w:pict>
-      </w:r>
-    </w:p>
     <w:bookmarkEnd w:id="125"/>
-    <w:bookmarkEnd w:id="126"/>
-    <w:bookmarkStart w:id="135" w:name="assumptions-register"/>
+    <w:bookmarkStart w:id="126" w:name="site-access-gate"/>
     <w:p>
       <w:pPr>
-        <w:pStyle w:val="Heading2"/>
+        <w:pStyle w:val="Heading3"/>
       </w:pPr>
       <w:r>
-        <w:t xml:space="preserve">15. Assumptions register</w:t>
+        <w:t xml:space="preserve">14.7 Site access gate</w:t>
       </w:r>
     </w:p>
     <w:p>
@@ -45154,6 +45146,900 @@
         <w:pStyle w:val="FirstParagraph"/>
       </w:pPr>
       <w:r>
+        <w:rPr>
+          <w:b/>
+          <w:bCs/>
+        </w:rPr>
+        <w:t xml:space="preserve">Live since 2026-10-07.</w:t>
+      </w:r>
+      <w:r>
+        <w:t xml:space="preserve"> </w:t>
+      </w:r>
+      <w:r>
+        <w:t xml:space="preserve">Every page of the published site asks for an email</w:t>
+      </w:r>
+      <w:r>
+        <w:t xml:space="preserve"> </w:t>
+      </w:r>
+      <w:r>
+        <w:t xml:space="preserve">and a password. The offline copy, opened from disk, opens without one. The</w:t>
+      </w:r>
+      <w:r>
+        <w:t xml:space="preserve"> </w:t>
+      </w:r>
+      <w:r>
+        <w:t xml:space="preserve">build notes and the test record are in</w:t>
+      </w:r>
+      <w:r>
+        <w:t xml:space="preserve"> </w:t>
+      </w:r>
+      <w:r>
+        <w:rPr>
+          <w:rStyle w:val="VerbatimChar"/>
+        </w:rPr>
+        <w:t xml:space="preserve">docs_implementation/passwordSystem/</w:t>
+      </w:r>
+      <w:r>
+        <w:t xml:space="preserve">.</w:t>
+      </w:r>
+    </w:p>
+    <w:p>
+      <w:pPr>
+        <w:pStyle w:val="BodyText"/>
+      </w:pPr>
+      <w:r>
+        <w:rPr>
+          <w:b/>
+          <w:bCs/>
+        </w:rPr>
+        <w:t xml:space="preserve">How a request arrives.</w:t>
+      </w:r>
+      <w:r>
+        <w:t xml:space="preserve"> </w:t>
+      </w:r>
+      <w:r>
+        <w:t xml:space="preserve">A visitor clicks</w:t>
+      </w:r>
+      <w:r>
+        <w:t xml:space="preserve"> </w:t>
+      </w:r>
+      <w:r>
+        <w:t xml:space="preserve">“Request access”</w:t>
+      </w:r>
+      <w:r>
+        <w:t xml:space="preserve"> </w:t>
+      </w:r>
+      <w:r>
+        <w:t xml:space="preserve">on the NEXA-web card</w:t>
+      </w:r>
+      <w:r>
+        <w:t xml:space="preserve"> </w:t>
+      </w:r>
+      <w:r>
+        <w:t xml:space="preserve">of the RHlab Tools page and fills in the form. The lab inbox,</w:t>
+      </w:r>
+      <w:r>
+        <w:t xml:space="preserve"> </w:t>
+      </w:r>
+      <w:r>
+        <w:rPr>
+          <w:rStyle w:val="VerbatimChar"/>
+        </w:rPr>
+        <w:t xml:space="preserve">resilienthabitatlab@gmail.com</w:t>
+      </w:r>
+      <w:r>
+        <w:t xml:space="preserve">, receives an email titled</w:t>
+      </w:r>
+      <w:r>
+        <w:t xml:space="preserve"> </w:t>
+      </w:r>
+      <w:r>
+        <w:rPr>
+          <w:b/>
+          <w:bCs/>
+        </w:rPr>
+        <w:t xml:space="preserve">NEXA-web Access</w:t>
+      </w:r>
+      <w:r>
+        <w:rPr>
+          <w:b/>
+          <w:bCs/>
+        </w:rPr>
+        <w:t xml:space="preserve"> </w:t>
+      </w:r>
+      <w:r>
+        <w:rPr>
+          <w:b/>
+          <w:bCs/>
+        </w:rPr>
+        <w:t xml:space="preserve">Request</w:t>
+      </w:r>
+      <w:r>
+        <w:t xml:space="preserve"> </w:t>
+      </w:r>
+      <w:r>
+        <w:t xml:space="preserve">with the visitor’s email, role and intended use. Replying to it</w:t>
+      </w:r>
+      <w:r>
+        <w:t xml:space="preserve"> </w:t>
+      </w:r>
+      <w:r>
+        <w:t xml:space="preserve">answers the visitor directly.</w:t>
+      </w:r>
+    </w:p>
+    <w:p>
+      <w:pPr>
+        <w:pStyle w:val="BodyText"/>
+      </w:pPr>
+      <w:r>
+        <w:rPr>
+          <w:b/>
+          <w:bCs/>
+        </w:rPr>
+        <w:t xml:space="preserve">How to approve a request.</w:t>
+      </w:r>
+    </w:p>
+    <w:p>
+      <w:pPr>
+        <w:pStyle w:val="Compact"/>
+        <w:numPr>
+          <w:ilvl w:val="0"/>
+          <w:numId w:val="1034"/>
+        </w:numPr>
+      </w:pPr>
+      <w:r>
+        <w:t xml:space="preserve">Open the Google Sheet</w:t>
+      </w:r>
+      <w:r>
+        <w:t xml:space="preserve"> </w:t>
+      </w:r>
+      <w:r>
+        <w:rPr>
+          <w:b/>
+          <w:bCs/>
+        </w:rPr>
+        <w:t xml:space="preserve">NEXA-web User Verification</w:t>
+      </w:r>
+      <w:r>
+        <w:t xml:space="preserve">, in the Drive folder</w:t>
+      </w:r>
+      <w:r>
+        <w:t xml:space="preserve"> </w:t>
+      </w:r>
+      <w:r>
+        <w:t xml:space="preserve">“NEXA-web”</w:t>
+      </w:r>
+      <w:r>
+        <w:t xml:space="preserve">. Row 1 holds the headers: Email, Password, DeviceID, Status,</w:t>
+      </w:r>
+      <w:r>
+        <w:t xml:space="preserve"> </w:t>
+      </w:r>
+      <w:r>
+        <w:t xml:space="preserve">LastLogin, Notes.</w:t>
+      </w:r>
+    </w:p>
+    <w:p>
+      <w:pPr>
+        <w:pStyle w:val="Compact"/>
+        <w:numPr>
+          <w:ilvl w:val="0"/>
+          <w:numId w:val="1034"/>
+        </w:numPr>
+      </w:pPr>
+      <w:r>
+        <w:t xml:space="preserve">Add one row: the visitor’s email, a password you choose,</w:t>
+      </w:r>
+      <w:r>
+        <w:t xml:space="preserve"> </w:t>
+      </w:r>
+      <w:r>
+        <w:rPr>
+          <w:rStyle w:val="VerbatimChar"/>
+        </w:rPr>
+        <w:t xml:space="preserve">active</w:t>
+      </w:r>
+      <w:r>
+        <w:t xml:space="preserve"> </w:t>
+      </w:r>
+      <w:r>
+        <w:t xml:space="preserve">under</w:t>
+      </w:r>
+      <w:r>
+        <w:t xml:space="preserve"> </w:t>
+      </w:r>
+      <w:r>
+        <w:t xml:space="preserve">Status. Leave DeviceID and LastLogin empty; the script fills them at the</w:t>
+      </w:r>
+      <w:r>
+        <w:t xml:space="preserve"> </w:t>
+      </w:r>
+      <w:r>
+        <w:t xml:space="preserve">first sign-in. Notes is free text.</w:t>
+      </w:r>
+    </w:p>
+    <w:p>
+      <w:pPr>
+        <w:pStyle w:val="Compact"/>
+        <w:numPr>
+          <w:ilvl w:val="0"/>
+          <w:numId w:val="1034"/>
+        </w:numPr>
+      </w:pPr>
+      <w:r>
+        <w:t xml:space="preserve">Reply to the request with the invitation below.</w:t>
+      </w:r>
+    </w:p>
+    <w:p>
+      <w:pPr>
+        <w:pStyle w:val="BlockText"/>
+      </w:pPr>
+      <w:r>
+        <w:t xml:space="preserve">Subject: Your access to NEXA-web</w:t>
+      </w:r>
+    </w:p>
+    <w:p>
+      <w:pPr>
+        <w:pStyle w:val="BlockText"/>
+      </w:pPr>
+      <w:r>
+        <w:t xml:space="preserve">Dear [Name],</w:t>
+      </w:r>
+    </w:p>
+    <w:p>
+      <w:pPr>
+        <w:pStyle w:val="BlockText"/>
+      </w:pPr>
+      <w:r>
+        <w:t xml:space="preserve">Thank you for your interest in NEXA-web. You can now access the platform</w:t>
+      </w:r>
+      <w:r>
+        <w:t xml:space="preserve"> </w:t>
+      </w:r>
+      <w:r>
+        <w:t xml:space="preserve">with the details below.</w:t>
+      </w:r>
+    </w:p>
+    <w:p>
+      <w:pPr>
+        <w:pStyle w:val="BlockText"/>
+      </w:pPr>
+      <w:r>
+        <w:t xml:space="preserve">Website: https://carolinehvermette.github.io/NEXA-Web/</w:t>
+      </w:r>
+    </w:p>
+    <w:p>
+      <w:pPr>
+        <w:pStyle w:val="BlockText"/>
+      </w:pPr>
+      <w:r>
+        <w:t xml:space="preserve">Email: [email]</w:t>
+      </w:r>
+    </w:p>
+    <w:p>
+      <w:pPr>
+        <w:pStyle w:val="BlockText"/>
+      </w:pPr>
+      <w:r>
+        <w:t xml:space="preserve">Password: [password]</w:t>
+      </w:r>
+    </w:p>
+    <w:p>
+      <w:pPr>
+        <w:pStyle w:val="BlockText"/>
+      </w:pPr>
+      <w:r>
+        <w:t xml:space="preserve">Your account is linked to the first browser you sign in with. If you need to</w:t>
+      </w:r>
+      <w:r>
+        <w:t xml:space="preserve"> </w:t>
+      </w:r>
+      <w:r>
+        <w:t xml:space="preserve">change computer or browser, reply to this email and we will reset it.</w:t>
+      </w:r>
+    </w:p>
+    <w:p>
+      <w:pPr>
+        <w:pStyle w:val="BlockText"/>
+      </w:pPr>
+      <w:r>
+        <w:t xml:space="preserve">NEXA-web is intended for early-stage pre-feasibility exploration, not detailed</w:t>
+      </w:r>
+      <w:r>
+        <w:t xml:space="preserve"> </w:t>
+      </w:r>
+      <w:r>
+        <w:t xml:space="preserve">design.</w:t>
+      </w:r>
+    </w:p>
+    <w:p>
+      <w:pPr>
+        <w:pStyle w:val="BlockText"/>
+      </w:pPr>
+      <w:r>
+        <w:t xml:space="preserve">Kind regards,</w:t>
+      </w:r>
+    </w:p>
+    <w:p>
+      <w:pPr>
+        <w:pStyle w:val="BlockText"/>
+      </w:pPr>
+      <w:r>
+        <w:t xml:space="preserve">Resilient Habitat Lab, Concordia University</w:t>
+      </w:r>
+    </w:p>
+    <w:p>
+      <w:pPr>
+        <w:pStyle w:val="FirstParagraph"/>
+      </w:pPr>
+      <w:r>
+        <w:rPr>
+          <w:b/>
+          <w:bCs/>
+        </w:rPr>
+        <w:t xml:space="preserve">Everyday changes.</w:t>
+      </w:r>
+    </w:p>
+    <w:p>
+      <w:pPr>
+        <w:pStyle w:val="Compact"/>
+        <w:numPr>
+          <w:ilvl w:val="0"/>
+          <w:numId w:val="1035"/>
+        </w:numPr>
+      </w:pPr>
+      <w:r>
+        <w:rPr>
+          <w:b/>
+          <w:bCs/>
+        </w:rPr>
+        <w:t xml:space="preserve">New computer or browser.</w:t>
+      </w:r>
+      <w:r>
+        <w:t xml:space="preserve"> </w:t>
+      </w:r>
+      <w:r>
+        <w:t xml:space="preserve">An account works in one browser only. A private</w:t>
+      </w:r>
+      <w:r>
+        <w:t xml:space="preserve"> </w:t>
+      </w:r>
+      <w:r>
+        <w:t xml:space="preserve">window, another browser or cleared site data counts as a new device. Clear the</w:t>
+      </w:r>
+      <w:r>
+        <w:t xml:space="preserve"> </w:t>
+      </w:r>
+      <w:r>
+        <w:t xml:space="preserve">user’s DeviceID cell and they can sign in again.</w:t>
+      </w:r>
+    </w:p>
+    <w:p>
+      <w:pPr>
+        <w:pStyle w:val="Compact"/>
+        <w:numPr>
+          <w:ilvl w:val="0"/>
+          <w:numId w:val="1035"/>
+        </w:numPr>
+      </w:pPr>
+      <w:r>
+        <w:rPr>
+          <w:b/>
+          <w:bCs/>
+        </w:rPr>
+        <w:t xml:space="preserve">Withdraw access.</w:t>
+      </w:r>
+      <w:r>
+        <w:t xml:space="preserve"> </w:t>
+      </w:r>
+      <w:r>
+        <w:t xml:space="preserve">Set Status to</w:t>
+      </w:r>
+      <w:r>
+        <w:t xml:space="preserve"> </w:t>
+      </w:r>
+      <w:r>
+        <w:rPr>
+          <w:rStyle w:val="VerbatimChar"/>
+        </w:rPr>
+        <w:t xml:space="preserve">revoked</w:t>
+      </w:r>
+      <w:r>
+        <w:t xml:space="preserve">. Any value other than</w:t>
+      </w:r>
+      <w:r>
+        <w:t xml:space="preserve"> </w:t>
+      </w:r>
+      <w:r>
+        <w:rPr>
+          <w:rStyle w:val="VerbatimChar"/>
+        </w:rPr>
+        <w:t xml:space="preserve">active</w:t>
+      </w:r>
+      <w:r>
+        <w:t xml:space="preserve"> </w:t>
+      </w:r>
+      <w:r>
+        <w:t xml:space="preserve">blocks sign-in.</w:t>
+      </w:r>
+    </w:p>
+    <w:p>
+      <w:pPr>
+        <w:pStyle w:val="Compact"/>
+        <w:numPr>
+          <w:ilvl w:val="0"/>
+          <w:numId w:val="1035"/>
+        </w:numPr>
+      </w:pPr>
+      <w:r>
+        <w:rPr>
+          <w:b/>
+          <w:bCs/>
+        </w:rPr>
+        <w:t xml:space="preserve">Session length.</w:t>
+      </w:r>
+      <w:r>
+        <w:t xml:space="preserve"> </w:t>
+      </w:r>
+      <w:r>
+        <w:t xml:space="preserve">A sign-in lasts</w:t>
+      </w:r>
+      <w:r>
+        <w:t xml:space="preserve"> </w:t>
+      </w:r>
+      <w:r>
+        <w:rPr>
+          <w:b/>
+          <w:bCs/>
+        </w:rPr>
+        <w:t xml:space="preserve">7 days</w:t>
+      </w:r>
+      <w:r>
+        <w:t xml:space="preserve"> </w:t>
+      </w:r>
+      <w:r>
+        <w:t xml:space="preserve">in that browser, then the site</w:t>
+      </w:r>
+      <w:r>
+        <w:t xml:space="preserve"> </w:t>
+      </w:r>
+      <w:r>
+        <w:t xml:space="preserve">asks again.</w:t>
+      </w:r>
+      <w:r>
+        <w:t xml:space="preserve"> </w:t>
+      </w:r>
+      <w:r>
+        <w:t xml:space="preserve">“Sign out”</w:t>
+      </w:r>
+      <w:r>
+        <w:t xml:space="preserve"> </w:t>
+      </w:r>
+      <w:r>
+        <w:t xml:space="preserve">ends it at once. The value is</w:t>
+      </w:r>
+      <w:r>
+        <w:t xml:space="preserve"> </w:t>
+      </w:r>
+      <w:r>
+        <w:rPr>
+          <w:rStyle w:val="VerbatimChar"/>
+        </w:rPr>
+        <w:t xml:space="preserve">SESSION_DAYS</w:t>
+      </w:r>
+      <w:r>
+        <w:t xml:space="preserve"> </w:t>
+      </w:r>
+      <w:r>
+        <w:t xml:space="preserve">in</w:t>
+      </w:r>
+      <w:r>
+        <w:t xml:space="preserve"> </w:t>
+      </w:r>
+      <w:r>
+        <w:rPr>
+          <w:rStyle w:val="VerbatimChar"/>
+        </w:rPr>
+        <w:t xml:space="preserve">js/auth.js</w:t>
+      </w:r>
+      <w:r>
+        <w:t xml:space="preserve">; changing it is a code change and needs the</w:t>
+      </w:r>
+      <w:r>
+        <w:t xml:space="preserve"> </w:t>
+      </w:r>
+      <w:r>
+        <w:rPr>
+          <w:rStyle w:val="VerbatimChar"/>
+        </w:rPr>
+        <w:t xml:space="preserve">?v=</w:t>
+      </w:r>
+      <w:r>
+        <w:t xml:space="preserve"> </w:t>
+      </w:r>
+      <w:r>
+        <w:t xml:space="preserve">bump of</w:t>
+      </w:r>
+      <w:r>
+        <w:t xml:space="preserve"> </w:t>
+      </w:r>
+      <w:r>
+        <w:t xml:space="preserve">section 10.2.</w:t>
+      </w:r>
+    </w:p>
+    <w:p>
+      <w:pPr>
+        <w:pStyle w:val="FirstParagraph"/>
+      </w:pPr>
+      <w:r>
+        <w:rPr>
+          <w:b/>
+          <w:bCs/>
+        </w:rPr>
+        <w:t xml:space="preserve">How it works.</w:t>
+      </w:r>
+      <w:r>
+        <w:t xml:space="preserve"> </w:t>
+      </w:r>
+      <w:r>
+        <w:rPr>
+          <w:rStyle w:val="VerbatimChar"/>
+        </w:rPr>
+        <w:t xml:space="preserve">login.html</w:t>
+      </w:r>
+      <w:r>
+        <w:t xml:space="preserve"> </w:t>
+      </w:r>
+      <w:r>
+        <w:t xml:space="preserve">and</w:t>
+      </w:r>
+      <w:r>
+        <w:t xml:space="preserve"> </w:t>
+      </w:r>
+      <w:r>
+        <w:rPr>
+          <w:rStyle w:val="VerbatimChar"/>
+        </w:rPr>
+        <w:t xml:space="preserve">js/auth.js</w:t>
+      </w:r>
+      <w:r>
+        <w:t xml:space="preserve"> </w:t>
+      </w:r>
+      <w:r>
+        <w:t xml:space="preserve">send the email, password and</w:t>
+      </w:r>
+      <w:r>
+        <w:t xml:space="preserve"> </w:t>
+      </w:r>
+      <w:r>
+        <w:t xml:space="preserve">browser identifier to a Google Apps Script bound to the sheet. The script</w:t>
+      </w:r>
+      <w:r>
+        <w:t xml:space="preserve"> </w:t>
+      </w:r>
+      <w:r>
+        <w:t xml:space="preserve">checks the row, records the device at the first sign-in, and answers yes or no.</w:t>
+      </w:r>
+      <w:r>
+        <w:t xml:space="preserve"> </w:t>
+      </w:r>
+      <w:r>
+        <w:t xml:space="preserve">Its source is</w:t>
+      </w:r>
+      <w:r>
+        <w:t xml:space="preserve"> </w:t>
+      </w:r>
+      <w:r>
+        <w:rPr>
+          <w:rStyle w:val="VerbatimChar"/>
+        </w:rPr>
+        <w:t xml:space="preserve">docs_implementation/passwordSystem/apps_script/Code.gs</w:t>
+      </w:r>
+      <w:r>
+        <w:t xml:space="preserve">. The</w:t>
+      </w:r>
+      <w:r>
+        <w:t xml:space="preserve"> </w:t>
+      </w:r>
+      <w:r>
+        <w:t xml:space="preserve">script’s</w:t>
+      </w:r>
+      <w:r>
+        <w:t xml:space="preserve"> </w:t>
+      </w:r>
+      <w:r>
+        <w:rPr>
+          <w:rStyle w:val="VerbatimChar"/>
+        </w:rPr>
+        <w:t xml:space="preserve">/exec</w:t>
+      </w:r>
+      <w:r>
+        <w:t xml:space="preserve"> </w:t>
+      </w:r>
+      <w:r>
+        <w:t xml:space="preserve">address in</w:t>
+      </w:r>
+      <w:r>
+        <w:t xml:space="preserve"> </w:t>
+      </w:r>
+      <w:r>
+        <w:rPr>
+          <w:rStyle w:val="VerbatimChar"/>
+        </w:rPr>
+        <w:t xml:space="preserve">js/auth.js</w:t>
+      </w:r>
+      <w:r>
+        <w:t xml:space="preserve"> </w:t>
+      </w:r>
+      <w:r>
+        <w:t xml:space="preserve">is the only Google identifier in the</w:t>
+      </w:r>
+      <w:r>
+        <w:t xml:space="preserve"> </w:t>
+      </w:r>
+      <w:r>
+        <w:t xml:space="preserve">repository; the sheet’s address is written nowhere.</w:t>
+      </w:r>
+    </w:p>
+    <w:p>
+      <w:pPr>
+        <w:pStyle w:val="BodyText"/>
+      </w:pPr>
+      <w:r>
+        <w:rPr>
+          <w:b/>
+          <w:bCs/>
+        </w:rPr>
+        <w:t xml:space="preserve">Changing the script.</w:t>
+      </w:r>
+      <w:r>
+        <w:t xml:space="preserve"> </w:t>
+      </w:r>
+      <w:r>
+        <w:t xml:space="preserve">Edit</w:t>
+      </w:r>
+      <w:r>
+        <w:t xml:space="preserve"> </w:t>
+      </w:r>
+      <w:r>
+        <w:rPr>
+          <w:rStyle w:val="VerbatimChar"/>
+        </w:rPr>
+        <w:t xml:space="preserve">Code.gs</w:t>
+      </w:r>
+      <w:r>
+        <w:t xml:space="preserve">, push it to the bound script, then</w:t>
+      </w:r>
+      <w:r>
+        <w:t xml:space="preserve"> </w:t>
+      </w:r>
+      <w:r>
+        <w:t xml:space="preserve">update the</w:t>
+      </w:r>
+      <w:r>
+        <w:t xml:space="preserve"> </w:t>
+      </w:r>
+      <w:r>
+        <w:rPr>
+          <w:b/>
+          <w:bCs/>
+        </w:rPr>
+        <w:t xml:space="preserve">existing</w:t>
+      </w:r>
+      <w:r>
+        <w:t xml:space="preserve"> </w:t>
+      </w:r>
+      <w:r>
+        <w:t xml:space="preserve">deployment to a new version.</w:t>
+      </w:r>
+      <w:r>
+        <w:t xml:space="preserve"> </w:t>
+      </w:r>
+      <w:r>
+        <w:rPr>
+          <w:b/>
+          <w:bCs/>
+        </w:rPr>
+        <w:t xml:space="preserve">Never create a new</w:t>
+      </w:r>
+      <w:r>
+        <w:rPr>
+          <w:b/>
+          <w:bCs/>
+        </w:rPr>
+        <w:t xml:space="preserve"> </w:t>
+      </w:r>
+      <w:r>
+        <w:rPr>
+          <w:b/>
+          <w:bCs/>
+        </w:rPr>
+        <w:t xml:space="preserve">deployment</w:t>
+      </w:r>
+      <w:r>
+        <w:t xml:space="preserve">: it gets a new address and every sign-in fails until</w:t>
+      </w:r>
+      <w:r>
+        <w:t xml:space="preserve"> </w:t>
+      </w:r>
+      <w:r>
+        <w:rPr>
+          <w:rStyle w:val="VerbatimChar"/>
+        </w:rPr>
+        <w:t xml:space="preserve">js/auth.js</w:t>
+      </w:r>
+      <w:r>
+        <w:t xml:space="preserve"> </w:t>
+      </w:r>
+      <w:r>
+        <w:t xml:space="preserve">is changed and published.</w:t>
+      </w:r>
+    </w:p>
+    <w:p>
+      <w:pPr>
+        <w:pStyle w:val="BodyText"/>
+      </w:pPr>
+      <w:r>
+        <w:rPr>
+          <w:b/>
+          <w:bCs/>
+        </w:rPr>
+        <w:t xml:space="preserve">What the gate does not do.</w:t>
+      </w:r>
+      <w:r>
+        <w:t xml:space="preserve"> </w:t>
+      </w:r>
+      <w:r>
+        <w:t xml:space="preserve">It is a door, not a lock. The result data is</w:t>
+      </w:r>
+      <w:r>
+        <w:t xml:space="preserve"> </w:t>
+      </w:r>
+      <w:r>
+        <w:t xml:space="preserve">still a public file, so someone who knows its address can download it without</w:t>
+      </w:r>
+      <w:r>
+        <w:t xml:space="preserve"> </w:t>
+      </w:r>
+      <w:r>
+        <w:t xml:space="preserve">signing in. Encrypting it was considered and set aside for this version.</w:t>
+      </w:r>
+    </w:p>
+    <w:p>
+      <w:pPr>
+        <w:pStyle w:val="BodyText"/>
+      </w:pPr>
+      <w:r>
+        <w:rPr>
+          <w:b/>
+          <w:bCs/>
+        </w:rPr>
+        <w:t xml:space="preserve">Ownership.</w:t>
+      </w:r>
+      <w:r>
+        <w:t xml:space="preserve"> </w:t>
+      </w:r>
+      <w:r>
+        <w:t xml:space="preserve">The sheet and the script belong to</w:t>
+      </w:r>
+      <w:r>
+        <w:t xml:space="preserve"> </w:t>
+      </w:r>
+      <w:r>
+        <w:rPr>
+          <w:rStyle w:val="VerbatimChar"/>
+        </w:rPr>
+        <w:t xml:space="preserve">orcunkoraliseri@gmail.com</w:t>
+      </w:r>
+      <w:r>
+        <w:t xml:space="preserve">,</w:t>
+      </w:r>
+      <w:r>
+        <w:t xml:space="preserve"> </w:t>
+      </w:r>
+      <w:r>
+        <w:t xml:space="preserve">Koral’s personal Google account. Before the hand-over,</w:t>
+      </w:r>
+      <w:r>
+        <w:t xml:space="preserve"> </w:t>
+      </w:r>
+      <w:r>
+        <w:rPr>
+          <w:b/>
+          <w:bCs/>
+        </w:rPr>
+        <w:t xml:space="preserve">share the sheet with</w:t>
+      </w:r>
+      <w:r>
+        <w:rPr>
+          <w:b/>
+          <w:bCs/>
+        </w:rPr>
+        <w:t xml:space="preserve"> </w:t>
+      </w:r>
+      <w:r>
+        <w:rPr>
+          <w:b/>
+          <w:bCs/>
+        </w:rPr>
+        <w:t xml:space="preserve">edit rights</w:t>
+      </w:r>
+      <w:r>
+        <w:t xml:space="preserve"> </w:t>
+      </w:r>
+      <w:r>
+        <w:t xml:space="preserve">with whoever approves requests, or</w:t>
+      </w:r>
+      <w:r>
+        <w:t xml:space="preserve"> </w:t>
+      </w:r>
+      <w:r>
+        <w:rPr>
+          <w:b/>
+          <w:bCs/>
+        </w:rPr>
+        <w:t xml:space="preserve">transfer its ownership</w:t>
+      </w:r>
+      <w:r>
+        <w:t xml:space="preserve"> </w:t>
+      </w:r>
+      <w:r>
+        <w:t xml:space="preserve">to</w:t>
+      </w:r>
+      <w:r>
+        <w:t xml:space="preserve"> </w:t>
+      </w:r>
+      <w:r>
+        <w:t xml:space="preserve">the lab account. The script travels with the sheet.</w:t>
+      </w:r>
+      <w:r>
+        <w:t xml:space="preserve"> </w:t>
+      </w:r>
+      <w:r>
+        <w:rPr>
+          <w:b/>
+          <w:bCs/>
+        </w:rPr>
+        <w:t xml:space="preserve">No password from the</w:t>
+      </w:r>
+      <w:r>
+        <w:rPr>
+          <w:b/>
+          <w:bCs/>
+        </w:rPr>
+        <w:t xml:space="preserve"> </w:t>
+      </w:r>
+      <w:r>
+        <w:rPr>
+          <w:b/>
+          <w:bCs/>
+        </w:rPr>
+        <w:t xml:space="preserve">sheet is written in this guide or in either repository.</w:t>
+      </w:r>
+    </w:p>
+    <w:p>
+      <w:r>
+        <w:pict>
+          <v:rect style="width:0;height:1.5pt" o:hralign="center" o:hrstd="t" o:hr="t"/>
+        </w:pict>
+      </w:r>
+    </w:p>
+    <w:bookmarkEnd w:id="126"/>
+    <w:bookmarkEnd w:id="127"/>
+    <w:bookmarkStart w:id="136" w:name="assumptions-register"/>
+    <w:p>
+      <w:pPr>
+        <w:pStyle w:val="Heading2"/>
+      </w:pPr>
+      <w:r>
+        <w:t xml:space="preserve">15. Assumptions register</w:t>
+      </w:r>
+    </w:p>
+    <w:p>
+      <w:pPr>
+        <w:pStyle w:val="FirstParagraph"/>
+      </w:pPr>
+      <w:r>
         <w:t xml:space="preserve">Every value the tool asserts, with where it is stored and where it came from.</w:t>
       </w:r>
       <w:r>
@@ -45181,7 +46067,7 @@
         <w:t xml:space="preserve">provenance as a comment. This table is that file, read in one place.</w:t>
       </w:r>
     </w:p>
-    <w:bookmarkStart w:id="127" w:name="three-kinds-of-assumption"/>
+    <w:bookmarkStart w:id="128" w:name="three-kinds-of-assumption"/>
     <w:p>
       <w:pPr>
         <w:pStyle w:val="Heading3"/>
@@ -46089,8 +46975,8 @@
         <w:t xml:space="preserve">look equally editable, and only one of them is.</w:t>
       </w:r>
     </w:p>
-    <w:bookmarkEnd w:id="127"/>
-    <w:bookmarkStart w:id="128" w:name="units-and-bases"/>
+    <w:bookmarkEnd w:id="128"/>
+    <w:bookmarkStart w:id="129" w:name="units-and-bases"/>
     <w:p>
       <w:pPr>
         <w:pStyle w:val="Heading3"/>
@@ -46530,8 +47416,8 @@
         </w:tc>
       </w:tr>
     </w:tbl>
-    <w:bookmarkEnd w:id="128"/>
-    <w:bookmarkStart w:id="129" w:name="solar"/>
+    <w:bookmarkEnd w:id="129"/>
+    <w:bookmarkStart w:id="130" w:name="solar"/>
     <w:p>
       <w:pPr>
         <w:pStyle w:val="Heading3"/>
@@ -47641,8 +48527,8 @@
         </w:tc>
       </w:tr>
     </w:tbl>
-    <w:bookmarkEnd w:id="129"/>
-    <w:bookmarkStart w:id="130" w:name="mobility-and-vehicle-to-grid-1"/>
+    <w:bookmarkEnd w:id="130"/>
+    <w:bookmarkStart w:id="131" w:name="mobility-and-vehicle-to-grid-1"/>
     <w:p>
       <w:pPr>
         <w:pStyle w:val="Heading3"/>
@@ -49062,8 +49948,8 @@
         </w:tc>
       </w:tr>
     </w:tbl>
-    <w:bookmarkEnd w:id="130"/>
-    <w:bookmarkStart w:id="131" w:name="landscape-solar-1"/>
+    <w:bookmarkEnd w:id="131"/>
+    <w:bookmarkStart w:id="132" w:name="landscape-solar-1"/>
     <w:p>
       <w:pPr>
         <w:pStyle w:val="Heading3"/>
@@ -49673,8 +50559,8 @@
         </w:tc>
       </w:tr>
     </w:tbl>
-    <w:bookmarkEnd w:id="131"/>
-    <w:bookmarkStart w:id="132" w:name="climates-and-coverage"/>
+    <w:bookmarkEnd w:id="132"/>
+    <w:bookmarkStart w:id="133" w:name="climates-and-coverage"/>
     <w:p>
       <w:pPr>
         <w:pStyle w:val="Heading3"/>
@@ -50062,8 +50948,8 @@
         </w:tc>
       </w:tr>
     </w:tbl>
-    <w:bookmarkEnd w:id="132"/>
-    <w:bookmarkStart w:id="133" w:name="vocabulary"/>
+    <w:bookmarkEnd w:id="133"/>
+    <w:bookmarkStart w:id="134" w:name="vocabulary"/>
     <w:p>
       <w:pPr>
         <w:pStyle w:val="Heading3"/>
@@ -50309,8 +51195,8 @@
         </w:tc>
       </w:tr>
     </w:tbl>
-    <w:bookmarkEnd w:id="133"/>
-    <w:bookmarkStart w:id="134" w:name="source-publications"/>
+    <w:bookmarkEnd w:id="134"/>
+    <w:bookmarkStart w:id="135" w:name="source-publications"/>
     <w:p>
       <w:pPr>
         <w:pStyle w:val="Heading3"/>
@@ -50591,9 +51477,9 @@
         </w:pict>
       </w:r>
     </w:p>
-    <w:bookmarkEnd w:id="134"/>
     <w:bookmarkEnd w:id="135"/>
-    <w:bookmarkStart w:id="139" w:name="appendix-a-glossary"/>
+    <w:bookmarkEnd w:id="136"/>
+    <w:bookmarkStart w:id="140" w:name="appendix-a-glossary"/>
     <w:p>
       <w:pPr>
         <w:pStyle w:val="Heading2"/>
@@ -50602,7 +51488,7 @@
         <w:t xml:space="preserve">Appendix A, glossary</w:t>
       </w:r>
     </w:p>
-    <w:bookmarkStart w:id="136" w:name="a.1-terms"/>
+    <w:bookmarkStart w:id="137" w:name="a.1-terms"/>
     <w:p>
       <w:pPr>
         <w:pStyle w:val="Heading3"/>
@@ -51010,8 +51896,8 @@
         </w:tc>
       </w:tr>
     </w:tbl>
-    <w:bookmarkEnd w:id="136"/>
-    <w:bookmarkStart w:id="137" w:name="a.2-folders-and-files"/>
+    <w:bookmarkEnd w:id="137"/>
+    <w:bookmarkStart w:id="138" w:name="a.2-folders-and-files"/>
     <w:p>
       <w:pPr>
         <w:pStyle w:val="Heading3"/>
@@ -52090,8 +52976,8 @@
         <w:t xml:space="preserve">(section 14.6).</w:t>
       </w:r>
     </w:p>
-    <w:bookmarkEnd w:id="137"/>
-    <w:bookmarkStart w:id="138" w:name="a.3-simulation-repository-idf_reader"/>
+    <w:bookmarkEnd w:id="138"/>
+    <w:bookmarkStart w:id="139" w:name="a.3-simulation-repository-idf_reader"/>
     <w:p>
       <w:pPr>
         <w:pStyle w:val="Heading3"/>
@@ -52758,9 +53644,9 @@
         </w:tc>
       </w:tr>
     </w:tbl>
-    <w:bookmarkEnd w:id="138"/>
     <w:bookmarkEnd w:id="139"/>
-    <w:bookmarkStart w:id="142" w:name="appendix-b-status-vocabulary"/>
+    <w:bookmarkEnd w:id="140"/>
+    <w:bookmarkStart w:id="143" w:name="appendix-b-status-vocabulary"/>
     <w:p>
       <w:pPr>
         <w:pStyle w:val="Heading2"/>
@@ -52815,7 +53701,7 @@
         <w:t xml:space="preserve">: Describes the scientific confidence and source backing of energy figures and quantities displayed in the tool.</w:t>
       </w:r>
     </w:p>
-    <w:bookmarkStart w:id="140" w:name="task-status-vocabulary"/>
+    <w:bookmarkStart w:id="141" w:name="task-status-vocabulary"/>
     <w:p>
       <w:pPr>
         <w:pStyle w:val="Heading3"/>
@@ -53044,8 +53930,8 @@
         </w:tc>
       </w:tr>
     </w:tbl>
-    <w:bookmarkEnd w:id="140"/>
-    <w:bookmarkStart w:id="141" w:name="number-maturity-vocabulary"/>
+    <w:bookmarkEnd w:id="141"/>
+    <w:bookmarkStart w:id="142" w:name="number-maturity-vocabulary"/>
     <w:p>
       <w:pPr>
         <w:pStyle w:val="Heading3"/>
@@ -53250,9 +54136,9 @@
         <w:t xml:space="preserve">. It is deliberately kept separate from the four terms above.</w:t>
       </w:r>
     </w:p>
-    <w:bookmarkEnd w:id="141"/>
     <w:bookmarkEnd w:id="142"/>
-    <w:bookmarkStart w:id="143" w:name="Xee868bfbe350cf4272cbc0e8b3bebd8804876d9"/>
+    <w:bookmarkEnd w:id="143"/>
+    <w:bookmarkStart w:id="144" w:name="Xee868bfbe350cf4272cbc0e8b3bebd8804876d9"/>
     <w:p>
       <w:pPr>
         <w:pStyle w:val="Heading2"/>
@@ -54235,8 +55121,8 @@
         </w:pict>
       </w:r>
     </w:p>
-    <w:bookmarkEnd w:id="143"/>
-    <w:bookmarkStart w:id="145" w:name="appendix-d-revision-history"/>
+    <w:bookmarkEnd w:id="144"/>
+    <w:bookmarkStart w:id="146" w:name="appendix-d-revision-history"/>
     <w:p>
       <w:pPr>
         <w:pStyle w:val="Heading2"/>
@@ -57670,8 +58556,98 @@
           </w:p>
         </w:tc>
       </w:tr>
+      <w:tr>
+        <w:tc>
+          <w:tcPr/>
+          <w:p>
+            <w:pPr>
+              <w:pStyle w:val="TableCellText"/>
+            </w:pPr>
+            <w:r>
+              <w:rPr>
+                <w:b/>
+                <w:bCs/>
+              </w:rPr>
+              <w:t xml:space="preserve">3.4</w:t>
+            </w:r>
+            <w:r>
+              <w:t xml:space="preserve">, seventh addendum</w:t>
+            </w:r>
+          </w:p>
+        </w:tc>
+        <w:tc>
+          <w:tcPr/>
+          <w:p>
+            <w:pPr>
+              <w:pStyle w:val="TableCellText"/>
+            </w:pPr>
+            <w:r>
+              <w:rPr>
+                <w:b/>
+                <w:bCs/>
+              </w:rPr>
+              <w:t xml:space="preserve">2026-10-07</w:t>
+            </w:r>
+          </w:p>
+        </w:tc>
+        <w:tc>
+          <w:tcPr/>
+          <w:p>
+            <w:pPr>
+              <w:pStyle w:val="TableCellText"/>
+            </w:pPr>
+            <w:r>
+              <w:rPr>
+                <w:b/>
+                <w:bCs/>
+              </w:rPr>
+              <w:t xml:space="preserve">The site access gate went live.</w:t>
+            </w:r>
+            <w:r>
+              <w:t xml:space="preserve"> </w:t>
+            </w:r>
+            <w:r>
+              <w:t xml:space="preserve">New</w:t>
+            </w:r>
+            <w:r>
+              <w:t xml:space="preserve"> </w:t>
+            </w:r>
+            <w:r>
+              <w:rPr>
+                <w:b/>
+                <w:bCs/>
+              </w:rPr>
+              <w:t xml:space="preserve">section 14.7, site access gate</w:t>
+            </w:r>
+            <w:r>
+              <w:t xml:space="preserve">: how a request from the RHlab Tools page arrives, how to approve it in the sheet, the invitation text, device reset and withdrawal, the 7-day session, how to change the script without breaking the address, what the gate does not protect, and the sheet ownership to settle before the hand-over.</w:t>
+            </w:r>
+            <w:r>
+              <w:t xml:space="preserve"> </w:t>
+            </w:r>
+            <w:r>
+              <w:rPr>
+                <w:b/>
+                <w:bCs/>
+              </w:rPr>
+              <w:t xml:space="preserve">Nothing else changed</w:t>
+            </w:r>
+          </w:p>
+        </w:tc>
+        <w:tc>
+          <w:tcPr/>
+          <w:p>
+            <w:pPr>
+              <w:pStyle w:val="TableCellText"/>
+            </w:pPr>
+            <w:r>
+              <w:t xml:space="preserve">⬜</w:t>
+            </w:r>
+          </w:p>
+        </w:tc>
+      </w:tr>
     </w:tbl>
-    <w:bookmarkStart w:id="144" w:name="X01f8e565c3b2a5f77bf4acf40f791a5ede06a27"/>
+    <w:bookmarkStart w:id="145" w:name="X01f8e565c3b2a5f77bf4acf40f791a5ede06a27"/>
     <w:p>
       <w:pPr>
         <w:pStyle w:val="Heading3"/>
@@ -58176,9 +59152,9 @@
         </w:pict>
       </w:r>
     </w:p>
-    <w:bookmarkEnd w:id="144"/>
     <w:bookmarkEnd w:id="145"/>
-    <w:bookmarkStart w:id="146" w:name="appendix-e-common-change-procedures"/>
+    <w:bookmarkEnd w:id="146"/>
+    <w:bookmarkStart w:id="147" w:name="appendix-e-common-change-procedures"/>
     <w:p>
       <w:pPr>
         <w:pStyle w:val="Heading2"/>
@@ -58749,7 +59725,7 @@
         <w:pStyle w:val="Compact"/>
         <w:numPr>
           <w:ilvl w:val="0"/>
-          <w:numId w:val="1034"/>
+          <w:numId w:val="1036"/>
         </w:numPr>
       </w:pPr>
       <w:r>
@@ -58829,7 +59805,7 @@
         <w:pStyle w:val="Compact"/>
         <w:numPr>
           <w:ilvl w:val="0"/>
-          <w:numId w:val="1034"/>
+          <w:numId w:val="1036"/>
         </w:numPr>
       </w:pPr>
       <w:r>
@@ -58905,8 +59881,8 @@
         </w:pict>
       </w:r>
     </w:p>
-    <w:bookmarkEnd w:id="146"/>
-    <w:bookmarkStart w:id="147" w:name="appendix-f-live-site-check-of-2026-08-24"/>
+    <w:bookmarkEnd w:id="147"/>
+    <w:bookmarkStart w:id="148" w:name="appendix-f-live-site-check-of-2026-08-24"/>
     <w:p>
       <w:pPr>
         <w:pStyle w:val="Heading2"/>
@@ -60707,8 +61683,8 @@
         </w:pict>
       </w:r>
     </w:p>
-    <w:bookmarkEnd w:id="147"/>
-    <w:bookmarkStart w:id="148" w:name="X5f7894b23827b082bd8e4fb057396fe158265dd"/>
+    <w:bookmarkEnd w:id="148"/>
+    <w:bookmarkStart w:id="149" w:name="X5f7894b23827b082bd8e4fb057396fe158265dd"/>
     <w:p>
       <w:pPr>
         <w:pStyle w:val="Heading2"/>
@@ -62584,8 +63560,8 @@
         </w:pict>
       </w:r>
     </w:p>
-    <w:bookmarkEnd w:id="148"/>
-    <w:bookmarkStart w:id="153" w:name="appendix-g-independent-handover-test"/>
+    <w:bookmarkEnd w:id="149"/>
+    <w:bookmarkStart w:id="154" w:name="appendix-g-independent-handover-test"/>
     <w:p>
       <w:pPr>
         <w:pStyle w:val="Heading2"/>
@@ -62620,7 +63596,7 @@
         <w:t xml:space="preserve">The seven tasks are the ones Dr. Hachem-Vermette named, and none of them is a deployment. Publishing an update is section 11.1, and it is covered by the walkthrough in section 14.4, T3, T10 and T11, not here. Appendix C row 7 says the same.</w:t>
       </w:r>
     </w:p>
-    <w:bookmarkStart w:id="149" w:name="environment"/>
+    <w:bookmarkStart w:id="150" w:name="environment"/>
     <w:p>
       <w:pPr>
         <w:pStyle w:val="Heading3"/>
@@ -62662,8 +63638,8 @@
         <w:t xml:space="preserve">). Only standard tools are required (Python 3.x, modern web browser, Git, and Node.js for verification scripts). Do not install external frameworks or libraries outside those listed in section 9.</w:t>
       </w:r>
     </w:p>
-    <w:bookmarkEnd w:id="149"/>
-    <w:bookmarkStart w:id="150" w:name="test-rules-and-scoring"/>
+    <w:bookmarkEnd w:id="150"/>
+    <w:bookmarkStart w:id="151" w:name="test-rules-and-scoring"/>
     <w:p>
       <w:pPr>
         <w:pStyle w:val="Heading3"/>
@@ -62677,7 +63653,7 @@
         <w:pStyle w:val="Compact"/>
         <w:numPr>
           <w:ilvl w:val="0"/>
-          <w:numId w:val="1035"/>
+          <w:numId w:val="1037"/>
         </w:numPr>
       </w:pPr>
       <w:r>
@@ -62699,7 +63675,7 @@
         <w:pStyle w:val="Compact"/>
         <w:numPr>
           <w:ilvl w:val="0"/>
-          <w:numId w:val="1035"/>
+          <w:numId w:val="1037"/>
         </w:numPr>
       </w:pPr>
       <w:r>
@@ -62721,7 +63697,7 @@
         <w:pStyle w:val="Compact"/>
         <w:numPr>
           <w:ilvl w:val="0"/>
-          <w:numId w:val="1035"/>
+          <w:numId w:val="1037"/>
         </w:numPr>
       </w:pPr>
       <w:r>
@@ -62737,7 +63713,7 @@
         <w:pStyle w:val="Compact"/>
         <w:numPr>
           <w:ilvl w:val="1"/>
-          <w:numId w:val="1036"/>
+          <w:numId w:val="1038"/>
         </w:numPr>
       </w:pPr>
       <w:r>
@@ -62759,7 +63735,7 @@
         <w:pStyle w:val="Compact"/>
         <w:numPr>
           <w:ilvl w:val="1"/>
-          <w:numId w:val="1036"/>
+          <w:numId w:val="1038"/>
         </w:numPr>
       </w:pPr>
       <w:r>
@@ -62781,7 +63757,7 @@
         <w:pStyle w:val="Compact"/>
         <w:numPr>
           <w:ilvl w:val="1"/>
-          <w:numId w:val="1036"/>
+          <w:numId w:val="1038"/>
         </w:numPr>
       </w:pPr>
       <w:r>
@@ -62832,8 +63808,8 @@
         <w:t xml:space="preserve">, and never on the live site.</w:t>
       </w:r>
     </w:p>
-    <w:bookmarkEnd w:id="150"/>
-    <w:bookmarkStart w:id="151" w:name="test-tasks"/>
+    <w:bookmarkEnd w:id="151"/>
+    <w:bookmarkStart w:id="152" w:name="test-tasks"/>
     <w:p>
       <w:pPr>
         <w:pStyle w:val="Heading3"/>
@@ -63307,8 +64283,8 @@
         </w:tc>
       </w:tr>
     </w:tbl>
-    <w:bookmarkEnd w:id="151"/>
-    <w:bookmarkStart w:id="152" w:name="findings-log"/>
+    <w:bookmarkEnd w:id="152"/>
+    <w:bookmarkStart w:id="153" w:name="findings-log"/>
     <w:p>
       <w:pPr>
         <w:pStyle w:val="Heading3"/>
@@ -63580,9 +64556,9 @@
         </w:pict>
       </w:r>
     </w:p>
-    <w:bookmarkEnd w:id="152"/>
     <w:bookmarkEnd w:id="153"/>
-    <w:bookmarkStart w:id="154" w:name="Xdd4a51edc19bc2c17b6ef6fb051eaa40166dda0"/>
+    <w:bookmarkEnd w:id="154"/>
+    <w:bookmarkStart w:id="155" w:name="Xdd4a51edc19bc2c17b6ef6fb051eaa40166dda0"/>
     <w:p>
       <w:pPr>
         <w:pStyle w:val="Heading2"/>
@@ -65933,8 +66909,8 @@
         </w:tc>
       </w:tr>
     </w:tbl>
-    <w:bookmarkEnd w:id="154"/>
-    <w:bookmarkStart w:id="155" w:name="appendix-h-trial-troubleshooting"/>
+    <w:bookmarkEnd w:id="155"/>
+    <w:bookmarkStart w:id="156" w:name="appendix-h-trial-troubleshooting"/>
     <w:p>
       <w:pPr>
         <w:pStyle w:val="Heading2"/>
@@ -66218,8 +67194,8 @@
         </w:tc>
       </w:tr>
     </w:tbl>
-    <w:bookmarkEnd w:id="155"/>
     <w:bookmarkEnd w:id="156"/>
+    <w:bookmarkEnd w:id="157"/>
     <w:sectPr>
       <w:footnotePr>
         <w:numRestart w:val="eachSect"/>
@@ -67212,9 +68188,6 @@
     </w:lvlOverride>
   </w:num>
   <w:num w:numId="1034">
-    <w:abstractNumId w:val="991"/>
-  </w:num>
-  <w:num w:numId="1035">
     <w:abstractNumId w:val="99411"/>
     <w:lvlOverride w:ilvl="0">
       <w:startOverride w:val="1"/>
@@ -67244,7 +68217,43 @@
       <w:startOverride w:val="1"/>
     </w:lvlOverride>
   </w:num>
+  <w:num w:numId="1035">
+    <w:abstractNumId w:val="991"/>
+  </w:num>
   <w:num w:numId="1036">
+    <w:abstractNumId w:val="991"/>
+  </w:num>
+  <w:num w:numId="1037">
+    <w:abstractNumId w:val="99411"/>
+    <w:lvlOverride w:ilvl="0">
+      <w:startOverride w:val="1"/>
+    </w:lvlOverride>
+    <w:lvlOverride w:ilvl="1">
+      <w:startOverride w:val="1"/>
+    </w:lvlOverride>
+    <w:lvlOverride w:ilvl="2">
+      <w:startOverride w:val="1"/>
+    </w:lvlOverride>
+    <w:lvlOverride w:ilvl="3">
+      <w:startOverride w:val="1"/>
+    </w:lvlOverride>
+    <w:lvlOverride w:ilvl="4">
+      <w:startOverride w:val="1"/>
+    </w:lvlOverride>
+    <w:lvlOverride w:ilvl="5">
+      <w:startOverride w:val="1"/>
+    </w:lvlOverride>
+    <w:lvlOverride w:ilvl="6">
+      <w:startOverride w:val="1"/>
+    </w:lvlOverride>
+    <w:lvlOverride w:ilvl="7">
+      <w:startOverride w:val="1"/>
+    </w:lvlOverride>
+    <w:lvlOverride w:ilvl="8">
+      <w:startOverride w:val="1"/>
+    </w:lvlOverride>
+  </w:num>
+  <w:num w:numId="1038">
     <w:abstractNumId w:val="991"/>
   </w:num>
 </w:numbering>

</xml_diff>